<commit_message>
Trim Farid confession redundancy across Ch33, Ch36, Ch37
Co-Authored-By: Claude Sonnet 5.5 <noreply@anthropic.com>

Claude-Session: https://claude.ai/code/session_011sBVAmX35tPxqRASXqkfKn
</commit_message>
<xml_diff>
--- a/01_The_Blue_Silence/Manuscript/THE_BLUE_SILENCE_Chapter_33_The_Bargain.docx
+++ b/01_The_Blue_Silence/Manuscript/THE_BLUE_SILENCE_Chapter_33_The_Bargain.docx
@@ -836,55 +836,7 @@
         <w:jc w:val="left"/>
       </w:pPr>
       <w:r>
-        <w:t>“Undercover operations would have collapsed.”</w:t>
-      </w:r>
-    </w:p>
-    <w:p>
-      <w:pPr>
-        <w:jc w:val="left"/>
-      </w:pPr>
-      <w:r>
-        <w:t>“Yes.”</w:t>
-      </w:r>
-    </w:p>
-    <w:p>
-      <w:pPr>
-        <w:jc w:val="left"/>
-      </w:pPr>
-      <w:r>
-        <w:t>“Pending prosecutions would have been compromised.”</w:t>
-      </w:r>
-    </w:p>
-    <w:p>
-      <w:pPr>
-        <w:jc w:val="left"/>
-      </w:pPr>
-      <w:r>
-        <w:t>“Yes.”</w:t>
-      </w:r>
-    </w:p>
-    <w:p>
-      <w:pPr>
-        <w:jc w:val="left"/>
-      </w:pPr>
-      <w:r>
-        <w:t>“Innocent officers would have been named beside guilty ones.”</w:t>
-      </w:r>
-    </w:p>
-    <w:p>
-      <w:pPr>
-        <w:jc w:val="left"/>
-      </w:pPr>
-      <w:r>
-        <w:t>“Yes.”</w:t>
-      </w:r>
-    </w:p>
-    <w:p>
-      <w:pPr>
-        <w:jc w:val="left"/>
-      </w:pPr>
-      <w:r>
-        <w:t>“Criminals would have learned our methods.”</w:t>
+        <w:t>“Undercover operations would have collapsed. Pending prosecutions would have been compromised. Innocent officers would have been named beside guilty ones. Criminals would have learned our methods.”</w:t>
       </w:r>
     </w:p>
     <w:p>

</xml_diff>